<commit_message>
Add author photo to biography
Co-Authored-By: Claude Sonnet 5.5 <noreply@anthropic.com>
Claude-Session: https://claude.ai/code/session_01W7BsYRcZLtdsbCWh74quLv
</commit_message>
<xml_diff>
--- a/LLM_Maintenance_IEEE_Access_Resubmission.docx
+++ b/LLM_Maintenance_IEEE_Access_Resubmission.docx
@@ -14740,6 +14740,56 @@
         <w:keepLines/>
         <w:spacing w:before="240"/>
       </w:pPr>
+      <w:r xmlns:a="http://schemas.openxmlformats.org/drawingml/2006/main" xmlns:pic="http://schemas.openxmlformats.org/drawingml/2006/picture">
+        <w:rPr>
+          <w:noProof/>
+        </w:rPr>
+        <w:drawing>
+          <wp:anchor distT="0" distB="0" distL="0" distR="114300" simplePos="0" relativeHeight="251658240" behindDoc="0" locked="0" layoutInCell="1" allowOverlap="1">
+            <wp:simplePos x="0" y="0"/>
+            <wp:positionH relativeFrom="column">
+              <wp:posOffset>0</wp:posOffset>
+            </wp:positionH>
+            <wp:positionV relativeFrom="paragraph">
+              <wp:posOffset>25400</wp:posOffset>
+            </wp:positionV>
+            <wp:extent cx="914400" cy="1095000"/>
+            <wp:effectExtent l="0" t="0" r="0" b="0"/>
+            <wp:wrapSquare wrapText="bothSides"/>
+            <wp:docPr id="328" name="Author photo" descr="Photograph of Ook Lee"/>
+            <wp:cNvGraphicFramePr>
+              <a:graphicFrameLocks noChangeAspect="1"/>
+            </wp:cNvGraphicFramePr>
+            <a:graphic>
+              <a:graphicData uri="http://schemas.openxmlformats.org/drawingml/2006/picture">
+                <pic:pic>
+                  <pic:nvPicPr>
+                    <pic:cNvPr id="0" name="author_photo.jpg" descr="Photograph of Ook Lee"/>
+                    <pic:cNvPicPr>
+                      <a:picLocks noChangeAspect="1"/>
+                    </pic:cNvPicPr>
+                  </pic:nvPicPr>
+                  <pic:blipFill>
+                    <a:blip r:embed="rIdPhoto"/>
+                    <a:stretch>
+                      <a:fillRect/>
+                    </a:stretch>
+                  </pic:blipFill>
+                  <pic:spPr>
+                    <a:xfrm>
+                      <a:off x="0" y="0"/>
+                      <a:ext cx="914400" cy="1095000"/>
+                    </a:xfrm>
+                    <a:prstGeom prst="rect">
+                      <a:avLst/>
+                    </a:prstGeom>
+                  </pic:spPr>
+                </pic:pic>
+              </a:graphicData>
+            </a:graphic>
+          </wp:anchor>
+        </w:drawing>
+      </w:r>
       <w:r>
         <w:rPr>
           <w:rStyle w:val="AUBiosbd"/>

</xml_diff>

<commit_message>
Abbreviate journal and proceedings names in references (IEEE style)
Co-Authored-By: Claude Sonnet 5.5 <noreply@anthropic.com>
Claude-Session: https://claude.ai/code/session_01W7BsYRcZLtdsbCWh74quLv
</commit_message>
<xml_diff>
--- a/LLM_Maintenance_IEEE_Access_Resubmission.docx
+++ b/LLM_Maintenance_IEEE_Access_Resubmission.docx
@@ -14447,7 +14447,7 @@
           <w:i/>
           <w:iCs/>
         </w:rPr>
-        <w:t>IEEE Transactions on Knowledge and Data Engineering</w:t>
+        <w:t>IEEE Trans. Knowl. Data Eng.</w:t>
       </w:r>
       <w:r>
         <w:t>, vol. 31, no. 12, pp. 2346–2363, Dec. 2019.</w:t>
@@ -14497,7 +14497,7 @@
           <w:i/>
           <w:iCs/>
         </w:rPr>
-        <w:t>Proceedings of the National Academy of Sciences</w:t>
+        <w:t>Proc. Natl. Acad. Sci. U.S.A.</w:t>
       </w:r>
       <w:r>
         <w:t>, vol. 114, no. 13, pp. 3521–3526, 2017.</w:t>
@@ -14531,7 +14531,7 @@
           <w:i/>
           <w:iCs/>
         </w:rPr>
-        <w:t>ACM Computing Surveys</w:t>
+        <w:t>ACM Comput. Surv.</w:t>
       </w:r>
       <w:r>
         <w:t>, vol. 57, no. 3, Nov. 2024.</w:t>
@@ -14581,7 +14581,7 @@
           <w:i/>
           <w:iCs/>
         </w:rPr>
-        <w:t>Emergency Medicine Australasia</w:t>
+        <w:t>Emerg. Med. Australas.</w:t>
       </w:r>
       <w:r>
         <w:t>, vol. 38, no. 3, 2026.</w:t>
@@ -14671,7 +14671,7 @@
           <w:i/>
           <w:iCs/>
         </w:rPr>
-        <w:t>Advances in Neural Information Processing Systems (NeurIPS)</w:t>
+        <w:t>Proc. Adv. Neural Inf. Process. Syst. (NeurIPS)</w:t>
       </w:r>
       <w:r>
         <w:t>, vol. 30, 2017.</w:t>
@@ -14689,7 +14689,7 @@
           <w:i/>
           <w:iCs/>
         </w:rPr>
-        <w:t>Advances in Neural Information Processing Systems (NeurIPS)</w:t>
+        <w:t>Proc. Adv. Neural Inf. Process. Syst. (NeurIPS)</w:t>
       </w:r>
       <w:r>
         <w:t>, vol. 33, 2020.</w:t>
@@ -14710,7 +14710,7 @@
           <w:i/>
           <w:iCs/>
         </w:rPr>
-        <w:t>Advances in Neural Information Processing Systems (NeurIPS)</w:t>
+        <w:t>Proc. Adv. Neural Inf. Process. Syst. (NeurIPS)</w:t>
       </w:r>
       <w:r>
         <w:t>, vol. 35, 2022.</w:t>
@@ -14728,7 +14728,7 @@
           <w:i/>
           <w:iCs/>
         </w:rPr>
-        <w:t>ACM Computing Surveys</w:t>
+        <w:t>ACM Comput. Surv.</w:t>
       </w:r>
       <w:r>
         <w:t>, vol. 55, no. 12, pp. 1–38, 2023.</w:t>

</xml_diff>